<commit_message>
Drop personal touch from MuckRock body; add work-in-progress disclaimer
- MuckRock body: removed the (d) fee-waiver clause mentioning
  'deflockalamo.org' and 'public discussion at City Commission
  meetings' (too personal for an MuckRock request body that
  needs to read as a generic citizen request)
- MuckRock body: replaced the 'This request was prepared by
  de-flock Alamo' attribution with neutral statutory language
  ('This request is prepared under the New Mexico Inspection
  of Public Records Act')
- take-action.html: added a prominent 'WORK IN PROGRESS /
  NOT LEGAL ADVICE' disclaimer at the top of the FOIA callout,
  citing the IPRA / NMFOG for authoritative guidance
- documents.html: same disclaimer at the top of the templates
  section

Disclaimer source file at /tmp/disclaimer.txt; prepended to
both the paper letter and MuckRock body source files. PDF,
DOCX, and TXT versions of both rebuilt from the cleaned
sources.
</commit_message>
<xml_diff>
--- a/documents/alpr-ipra-muckrock-body.docx
+++ b/documents/alpr-ipra-muckrock-body.docx
@@ -2,6 +2,58 @@
 <file path=word/document.xml><?xml version="1.0" encoding="utf-8"?>
 <w:document xmlns:wpc="http://schemas.microsoft.com/office/word/2010/wordprocessingCanvas" xmlns:mo="http://schemas.microsoft.com/office/mac/office/2008/main" xmlns:mc="http://schemas.openxmlformats.org/markup-compatibility/2006" xmlns:mv="urn:schemas-microsoft-com:mac:vml" xmlns:o="urn:schemas-microsoft-com:office:office" xmlns:r="http://schemas.openxmlformats.org/officeDocument/2006/relationships" xmlns:m="http://schemas.openxmlformats.org/officeDocument/2006/math" xmlns:v="urn:schemas-microsoft-com:vml" xmlns:wp14="http://schemas.microsoft.com/office/word/2010/wordprocessingDrawing" xmlns:wp="http://schemas.openxmlformats.org/drawingml/2006/wordprocessingDrawing" xmlns:w10="urn:schemas-microsoft-com:office:word" xmlns:w="http://schemas.openxmlformats.org/wordprocessingml/2006/main" xmlns:w14="http://schemas.microsoft.com/office/word/2010/wordml" xmlns:wpg="http://schemas.microsoft.com/office/word/2010/wordprocessingGroup" xmlns:wpi="http://schemas.microsoft.com/office/word/2010/wordprocessingInk" xmlns:wne="http://schemas.microsoft.com/office/word/2006/wordml" xmlns:wps="http://schemas.microsoft.com/office/word/2010/wordprocessingShape" mc:Ignorable="w14 wp14">
   <w:body>
+    <w:p>
+      <w:r>
+        <w:rPr>
+          <w:sz w:val="22"/>
+        </w:rPr>
+        <w:t>════════════════════════════════════════════════════════════════════════════════</w:t>
+        <w:br/>
+        <w:t>⚠️  DRAFT — WORK IN PROGRESS — NOT LEGAL ADVICE</w:t>
+        <w:br/>
+        <w:t>════════════════════════════════════════════════════════════════════════════════</w:t>
+        <w:br/>
+        <w:t>This template is adapted from the Business Reform Open Records template</w:t>
+        <w:br/>
+        <w:t>(Indiana, June 2025) and has been rewritten for New Mexico's Inspection of</w:t>
+        <w:br/>
+        <w:t>Public Records Act (NMSA 1978 §§ 14-2-1 et seq.). It has NOT been reviewed</w:t>
+        <w:br/>
+        <w:t>by an attorney and may contain errors, outdated citations, or language that</w:t>
+        <w:br/>
+        <w:t>does not fit your specific request.</w:t>
+      </w:r>
+    </w:p>
+    <w:p>
+      <w:r>
+        <w:rPr>
+          <w:sz w:val="22"/>
+        </w:rPr>
+        <w:t>Before submitting to any agency:</w:t>
+        <w:br/>
+        <w:t xml:space="preserve">  1. Verify the agency's current address, phone, and email against its</w:t>
+        <w:br/>
+        <w:t xml:space="preserve">     official Public Records Request page.</w:t>
+        <w:br/>
+        <w:t xml:space="preserve">  2. Verify the IPRA citations against the current statute at nmag.gov.</w:t>
+        <w:br/>
+        <w:t xml:space="preserve">  3. Verify the case law and any agency-specific procedures.</w:t>
+        <w:br/>
+        <w:t xml:space="preserve">  4. Consider asking NMFOG (nmfog.org) to review your request — they</w:t>
+        <w:br/>
+        <w:t xml:space="preserve">     answer questions by email and have up-to-date sample language.</w:t>
+      </w:r>
+    </w:p>
+    <w:p>
+      <w:r>
+        <w:rPr>
+          <w:sz w:val="22"/>
+        </w:rPr>
+        <w:t>Address block, statutes, and contact details are current as of June 2026.</w:t>
+        <w:br/>
+        <w:t>════════════════════════════════════════════════════════════════════════════════</w:t>
+      </w:r>
+    </w:p>
     <w:p>
       <w:r>
         <w:rPr>
@@ -325,11 +377,9 @@
         </w:rPr>
         <w:t>(a) the records concern the operations of a public agency and the expenditure of public funds;</w:t>
         <w:br/>
-        <w:t>(b) the request is made for non-commercial purposes;</w:t>
+        <w:t>(b) the request is made for non-commercial purposes; and</w:t>
         <w:br/>
-        <w:t>(c) the records will contribute to public understanding of the City's ALPR program; and</w:t>
-        <w:br/>
-        <w:t>(d) the subject matter is a matter of significant and ongoing public interest in the community, as evidenced by public discussion at City Commission meetings and by the coverage of the program at deflockalamo.org.</w:t>
+        <w:t>(c) the records will contribute to public understanding of the City's ALPR program.</w:t>
       </w:r>
     </w:p>
     <w:p>
@@ -357,7 +407,7 @@
         <w:rPr>
           <w:sz w:val="22"/>
         </w:rPr>
-        <w:t>This request was prepared by de-flock Alamo (deflockalamo.org), a community information project. The address block, statutes, and contact details are current as of June 2026. If you receive a substantive response and are willing to share it, please contact de-flock Alamo via the website so the response can be included in the public record.</w:t>
+        <w:t>This request is prepared under the New Mexico Inspection of Public Records Act.</w:t>
       </w:r>
     </w:p>
     <w:sectPr>

</xml_diff>